<commit_message>
Usa HemaBot como nome do projeto
</commit_message>
<xml_diff>
--- a/docs/Atividade_Introducao_ROS2_Gazebo.docx
+++ b/docs/Atividade_Introducao_ROS2_Gazebo.docx
@@ -15,7 +15,7 @@
           <w:sz w:val="36"/>
           <w:u w:val="none"/>
         </w:rPr>
-        <w:t>TREINAMENTO ROS 2 E GAZEBO 2026.2</w:t>
+        <w:t>HEMABOT ROS 2 E GAZEBO 2026.2</w:t>
       </w:r>
     </w:p>
     <w:p>
@@ -44,7 +44,7 @@
           <w:color w:val="000000"/>
           <w:sz w:val="23"/>
         </w:rPr>
-        <w:t>O Treinamento HemaBot é um projeto introdutório de robótica móvel que orienta os alunos desde a preparação do ambiente no WSL 2 até o controle de um robô diferencial em um hospital simulado. Com ROS 2, Gazebo e Python, os participantes exploram nós e tópicos, enviam comandos de movimento e programam uma missão de entrega, observando na simulação os efeitos do código sobre o robô.</w:t>
+        <w:t>O HemaBot é um projeto introdutório de robótica móvel que orienta os alunos desde a preparação do ambiente no WSL 2 até o controle de um robô diferencial em um hospital simulado. Com ROS 2, Gazebo e Python, os participantes exploram nós e tópicos, enviam comandos de movimento e programam uma missão de entrega, observando na simulação os efeitos do código sobre o robô.</w:t>
       </w:r>
     </w:p>
     <w:p>
@@ -59,7 +59,7 @@
           <w:color w:val="000000"/>
           <w:sz w:val="23"/>
         </w:rPr>
-        <w:t>O projeto usado no treinamento é o repositório local treinamento_hemabot fornecido pelo professor. Não é necessário clonar um repositório externo.</w:t>
+        <w:t>O projeto usado na atividade é o repositório local treinamento_hemabot fornecido pelo professor. Não é necessário clonar um repositório externo.</w:t>
       </w:r>
     </w:p>
     <w:p>
@@ -629,7 +629,7 @@
           <w:sz w:val="29"/>
           <w:u w:val="single"/>
         </w:rPr>
-        <w:t>Parte 2 Treinamento prático</w:t>
+        <w:t>Parte 2 Atividade prática</w:t>
       </w:r>
     </w:p>
     <w:p>

</xml_diff>